<commit_message>
La regla de publicar estaba incompleta y tiro produccion
Decia "siempre npm run deploy" sin mencionar que ese comando NO aplica
migraciones. Rafael lo corrio con tres migraciones pendientes: el codigo nuevo
salio pidiendo WorkOrderTask.laborCost, que aun no existia, y el detalle de
ordenes quedo caido con un P2022 hasta que se corrio npm run actualizar.

La regla ahora distingue los dos casos y dice por que: actualizar corre pruebas,
migra, publica y verifica en ese orden; deploy solo publica.

Co-Authored-By: Claude Opus 5 <noreply@anthropic.com>
</commit_message>
<xml_diff>
--- a/Cambios y prompts.docx
+++ b/Cambios y prompts.docx
@@ -3834,6 +3834,9 @@
     <w:p/>
     <w:p>
       <w:r>
+        <w:rPr>
+          <w:noProof/>
+        </w:rPr>
         <w:drawing>
           <wp:inline distT="0" distB="0" distL="0" distR="0" wp14:anchorId="151F88BF" wp14:editId="18406C68">
             <wp:extent cx="5612130" cy="3156585"/>
@@ -3937,13 +3940,7 @@
       </w:pPr>
       <w:r>
         <w:lastRenderedPageBreak/>
-        <w:t xml:space="preserve">Si la OT se cierra y no se captura algo en alguna o en algunas actividades, que pasa con estas? </w:t>
-      </w:r>
-      <w:r>
-        <w:t>¿</w:t>
-      </w:r>
-      <w:r>
-        <w:t>Se da por asentado que se cierran?</w:t>
+        <w:t>Si la OT se cierra y no se captura algo en alguna o en algunas actividades, que pasa con estas? ¿Se da por asentado que se cierran?</w:t>
       </w:r>
     </w:p>
     <w:p/>
@@ -4257,6 +4254,46 @@
         <w:t>Creo que asi debe ser, dime que opinas… Esto implica restructurar y actualizar lo que acabas de hacer… Por cierto, en los Calendarios, acomoda mejor el encabezado y las opciones de filtro para que el calendario lo pueda ver sin escrollear hacia abajo…</w:t>
       </w:r>
     </w:p>
+    <w:p/>
+    <w:p/>
+    <w:p>
+      <w:pPr>
+        <w:pStyle w:val="Prrafodelista"/>
+        <w:numPr>
+          <w:ilvl w:val="0"/>
+          <w:numId w:val="16"/>
+        </w:numPr>
+      </w:pPr>
+      <w:r>
+        <w:t>Herramientas</w:t>
+      </w:r>
+    </w:p>
+    <w:p>
+      <w:pPr>
+        <w:pStyle w:val="Prrafodelista"/>
+        <w:numPr>
+          <w:ilvl w:val="0"/>
+          <w:numId w:val="16"/>
+        </w:numPr>
+      </w:pPr>
+      <w:r>
+        <w:t>Inventario fuera de sistema</w:t>
+      </w:r>
+    </w:p>
+    <w:p>
+      <w:pPr>
+        <w:pStyle w:val="Prrafodelista"/>
+        <w:numPr>
+          <w:ilvl w:val="0"/>
+          <w:numId w:val="16"/>
+        </w:numPr>
+      </w:pPr>
+      <w:r>
+        <w:t>Conexión externa / PCL</w:t>
+      </w:r>
+    </w:p>
+    <w:p/>
+    <w:p/>
     <w:sectPr>
       <w:pgSz w:w="12240" w:h="15840"/>
       <w:pgMar w:top="1417" w:right="1701" w:bottom="1417" w:left="1701" w:header="708" w:footer="708" w:gutter="0"/>
@@ -5580,6 +5617,119 @@
     </w:lvl>
   </w:abstractNum>
   <w:abstractNum w:abstractNumId="10" w15:restartNumberingAfterBreak="0">
+    <w:nsid w:val="52F54252"/>
+    <w:multiLevelType w:val="hybridMultilevel"/>
+    <w:tmpl w:val="F6BAC864"/>
+    <w:lvl w:ilvl="0" w:tplc="080A0001">
+      <w:start w:val="1"/>
+      <w:numFmt w:val="bullet"/>
+      <w:lvlText w:val=""/>
+      <w:lvlJc w:val="left"/>
+      <w:pPr>
+        <w:ind w:left="720" w:hanging="360"/>
+      </w:pPr>
+      <w:rPr>
+        <w:rFonts w:ascii="Symbol" w:hAnsi="Symbol" w:hint="default"/>
+      </w:rPr>
+    </w:lvl>
+    <w:lvl w:ilvl="1" w:tplc="080A0003" w:tentative="1">
+      <w:start w:val="1"/>
+      <w:numFmt w:val="bullet"/>
+      <w:lvlText w:val="o"/>
+      <w:lvlJc w:val="left"/>
+      <w:pPr>
+        <w:ind w:left="1440" w:hanging="360"/>
+      </w:pPr>
+      <w:rPr>
+        <w:rFonts w:ascii="Courier New" w:hAnsi="Courier New" w:cs="Courier New" w:hint="default"/>
+      </w:rPr>
+    </w:lvl>
+    <w:lvl w:ilvl="2" w:tplc="080A0005" w:tentative="1">
+      <w:start w:val="1"/>
+      <w:numFmt w:val="bullet"/>
+      <w:lvlText w:val=""/>
+      <w:lvlJc w:val="left"/>
+      <w:pPr>
+        <w:ind w:left="2160" w:hanging="360"/>
+      </w:pPr>
+      <w:rPr>
+        <w:rFonts w:ascii="Wingdings" w:hAnsi="Wingdings" w:hint="default"/>
+      </w:rPr>
+    </w:lvl>
+    <w:lvl w:ilvl="3" w:tplc="080A0001" w:tentative="1">
+      <w:start w:val="1"/>
+      <w:numFmt w:val="bullet"/>
+      <w:lvlText w:val=""/>
+      <w:lvlJc w:val="left"/>
+      <w:pPr>
+        <w:ind w:left="2880" w:hanging="360"/>
+      </w:pPr>
+      <w:rPr>
+        <w:rFonts w:ascii="Symbol" w:hAnsi="Symbol" w:hint="default"/>
+      </w:rPr>
+    </w:lvl>
+    <w:lvl w:ilvl="4" w:tplc="080A0003" w:tentative="1">
+      <w:start w:val="1"/>
+      <w:numFmt w:val="bullet"/>
+      <w:lvlText w:val="o"/>
+      <w:lvlJc w:val="left"/>
+      <w:pPr>
+        <w:ind w:left="3600" w:hanging="360"/>
+      </w:pPr>
+      <w:rPr>
+        <w:rFonts w:ascii="Courier New" w:hAnsi="Courier New" w:cs="Courier New" w:hint="default"/>
+      </w:rPr>
+    </w:lvl>
+    <w:lvl w:ilvl="5" w:tplc="080A0005" w:tentative="1">
+      <w:start w:val="1"/>
+      <w:numFmt w:val="bullet"/>
+      <w:lvlText w:val=""/>
+      <w:lvlJc w:val="left"/>
+      <w:pPr>
+        <w:ind w:left="4320" w:hanging="360"/>
+      </w:pPr>
+      <w:rPr>
+        <w:rFonts w:ascii="Wingdings" w:hAnsi="Wingdings" w:hint="default"/>
+      </w:rPr>
+    </w:lvl>
+    <w:lvl w:ilvl="6" w:tplc="080A0001" w:tentative="1">
+      <w:start w:val="1"/>
+      <w:numFmt w:val="bullet"/>
+      <w:lvlText w:val=""/>
+      <w:lvlJc w:val="left"/>
+      <w:pPr>
+        <w:ind w:left="5040" w:hanging="360"/>
+      </w:pPr>
+      <w:rPr>
+        <w:rFonts w:ascii="Symbol" w:hAnsi="Symbol" w:hint="default"/>
+      </w:rPr>
+    </w:lvl>
+    <w:lvl w:ilvl="7" w:tplc="080A0003" w:tentative="1">
+      <w:start w:val="1"/>
+      <w:numFmt w:val="bullet"/>
+      <w:lvlText w:val="o"/>
+      <w:lvlJc w:val="left"/>
+      <w:pPr>
+        <w:ind w:left="5760" w:hanging="360"/>
+      </w:pPr>
+      <w:rPr>
+        <w:rFonts w:ascii="Courier New" w:hAnsi="Courier New" w:cs="Courier New" w:hint="default"/>
+      </w:rPr>
+    </w:lvl>
+    <w:lvl w:ilvl="8" w:tplc="080A0005" w:tentative="1">
+      <w:start w:val="1"/>
+      <w:numFmt w:val="bullet"/>
+      <w:lvlText w:val=""/>
+      <w:lvlJc w:val="left"/>
+      <w:pPr>
+        <w:ind w:left="6480" w:hanging="360"/>
+      </w:pPr>
+      <w:rPr>
+        <w:rFonts w:ascii="Wingdings" w:hAnsi="Wingdings" w:hint="default"/>
+      </w:rPr>
+    </w:lvl>
+  </w:abstractNum>
+  <w:abstractNum w:abstractNumId="11" w15:restartNumberingAfterBreak="0">
     <w:nsid w:val="531C210B"/>
     <w:multiLevelType w:val="multilevel"/>
     <w:tmpl w:val="C320179C"/>
@@ -5728,7 +5878,7 @@
       </w:rPr>
     </w:lvl>
   </w:abstractNum>
-  <w:abstractNum w:abstractNumId="11" w15:restartNumberingAfterBreak="0">
+  <w:abstractNum w:abstractNumId="12" w15:restartNumberingAfterBreak="0">
     <w:nsid w:val="5BB86723"/>
     <w:multiLevelType w:val="multilevel"/>
     <w:tmpl w:val="CCA2076C"/>
@@ -5841,7 +5991,7 @@
       </w:pPr>
     </w:lvl>
   </w:abstractNum>
-  <w:abstractNum w:abstractNumId="12" w15:restartNumberingAfterBreak="0">
+  <w:abstractNum w:abstractNumId="13" w15:restartNumberingAfterBreak="0">
     <w:nsid w:val="5D3A4D64"/>
     <w:multiLevelType w:val="multilevel"/>
     <w:tmpl w:val="96E417EA"/>
@@ -5954,7 +6104,7 @@
       </w:pPr>
     </w:lvl>
   </w:abstractNum>
-  <w:abstractNum w:abstractNumId="13" w15:restartNumberingAfterBreak="0">
+  <w:abstractNum w:abstractNumId="14" w15:restartNumberingAfterBreak="0">
     <w:nsid w:val="6C111D4E"/>
     <w:multiLevelType w:val="multilevel"/>
     <w:tmpl w:val="FDD21BD2"/>
@@ -6067,7 +6217,7 @@
       </w:pPr>
     </w:lvl>
   </w:abstractNum>
-  <w:abstractNum w:abstractNumId="14" w15:restartNumberingAfterBreak="0">
+  <w:abstractNum w:abstractNumId="15" w15:restartNumberingAfterBreak="0">
     <w:nsid w:val="77763857"/>
     <w:multiLevelType w:val="multilevel"/>
     <w:tmpl w:val="304C4324"/>
@@ -6223,13 +6373,13 @@
     <w:abstractNumId w:val="8"/>
   </w:num>
   <w:num w:numId="3" w16cid:durableId="1501502481">
-    <w:abstractNumId w:val="13"/>
+    <w:abstractNumId w:val="14"/>
   </w:num>
   <w:num w:numId="4" w16cid:durableId="55204768">
-    <w:abstractNumId w:val="14"/>
+    <w:abstractNumId w:val="15"/>
   </w:num>
   <w:num w:numId="5" w16cid:durableId="144705698">
-    <w:abstractNumId w:val="11"/>
+    <w:abstractNumId w:val="12"/>
   </w:num>
   <w:num w:numId="6" w16cid:durableId="1894392487">
     <w:abstractNumId w:val="9"/>
@@ -6247,7 +6397,7 @@
     <w:abstractNumId w:val="0"/>
   </w:num>
   <w:num w:numId="11" w16cid:durableId="1958827324">
-    <w:abstractNumId w:val="12"/>
+    <w:abstractNumId w:val="13"/>
   </w:num>
   <w:num w:numId="12" w16cid:durableId="1255550118">
     <w:abstractNumId w:val="4"/>
@@ -6256,10 +6406,13 @@
     <w:abstractNumId w:val="7"/>
   </w:num>
   <w:num w:numId="14" w16cid:durableId="169494029">
-    <w:abstractNumId w:val="10"/>
+    <w:abstractNumId w:val="11"/>
   </w:num>
   <w:num w:numId="15" w16cid:durableId="352609091">
     <w:abstractNumId w:val="3"/>
+  </w:num>
+  <w:num w:numId="16" w16cid:durableId="2056587492">
+    <w:abstractNumId w:val="10"/>
   </w:num>
 </w:numbering>
 </file>

</xml_diff>

<commit_message>
Bitacora: la pregunta de las solicitudes sin codigo QR
Se agregan 171 palabras al documento de cambios y prompts, sin quitar nada:
el planteamiento de que pasa cuando quien reporta no trae a la mano el QR del
activo, y si la pantalla de solicitud necesita su propio control de acceso.

De ahi salieron los dos cambios de hoy: que quien revisa pueda ponerle el
equipo a un reporte que llego sin el, y la conversion de solicitudes saliendo
de la ruta a lib/solicitudes.ts.
</commit_message>
<xml_diff>
--- a/Cambios y prompts.docx
+++ b/Cambios y prompts.docx
@@ -4361,6 +4361,22 @@
     </w:p>
     <w:p/>
     <w:p/>
+    <w:p/>
+    <w:p/>
+    <w:p/>
+    <w:p/>
+    <w:p>
+      <w:r>
+        <w:t>En el caso de Solicitud de Servicio… El código QR de los Activos</w:t>
+      </w:r>
+      <w:r>
+        <w:t xml:space="preserve"> lo lleva a la página del formulario donde se levanta la Solicitud…  Que pasa si el usuario / operador del equipo no tiene a la mano dichos códigos QR y desea levantar de forma directa la Solicitud? En este caso habría que seleccionar el Activo, lo que haría que la página tuviera la lista completa de equipos y no sabemos quien pueda estar capturando… Aquí requiero tu opinión… La Solicitud se puede capturar con una definicón del </w:t>
+      </w:r>
+      <w:r>
+        <w:lastRenderedPageBreak/>
+        <w:t>usuario y hasta que llega a manos del Gestor de Mantenimiento, el asocia dicha Solicitud con un Equipo (Ya dentro del Sistema…)… La otra pregunta es, el acceso a la pantalla de la Solicitud de Servicio, tiene que tener control de acceso? Tenemos que manejar usuario y password que el Gestor de Mantenimiento de de alta (que es por separado el control de acceso del Sistema…) para que el usuario pueda firmarse y levantar la Solicitud…. Que opinas, como lo manejamos?</w:t>
+      </w:r>
+    </w:p>
     <w:sectPr>
       <w:pgSz w:w="12240" w:h="15840"/>
       <w:pgMar w:top="1417" w:right="1701" w:bottom="1417" w:left="1701" w:header="708" w:footer="708" w:gutter="0"/>

</xml_diff>

<commit_message>
Bitacora de cambios y prompts al dia
El documento que Rafael lleva con el registro de cambios y los prompts de
cada sesion. Crecio ~1 KB: lo de la sesion del calendario por actividad.

Es un binario, asi que el diff no dice nada util; se versiona para no
perderlo y para que viaje en el respaldo.

Co-Authored-By: Claude Opus 5 <noreply@anthropic.com>
</commit_message>
<xml_diff>
--- a/Cambios y prompts.docx
+++ b/Cambios y prompts.docx
@@ -4375,6 +4375,22 @@
       <w:r>
         <w:lastRenderedPageBreak/>
         <w:t>usuario y hasta que llega a manos del Gestor de Mantenimiento, el asocia dicha Solicitud con un Equipo (Ya dentro del Sistema…)… La otra pregunta es, el acceso a la pantalla de la Solicitud de Servicio, tiene que tener control de acceso? Tenemos que manejar usuario y password que el Gestor de Mantenimiento de de alta (que es por separado el control de acceso del Sistema…) para que el usuario pueda firmarse y levantar la Solicitud…. Que opinas, como lo manejamos?</w:t>
+      </w:r>
+    </w:p>
+    <w:p/>
+    <w:p>
+      <w:hyperlink r:id="rId7" w:history="1">
+        <w:r>
+          <w:rPr>
+            <w:rStyle w:val="Hipervnculo"/>
+          </w:rPr>
+          <w:t>tucorreo@ejemplo.mx</w:t>
+        </w:r>
+      </w:hyperlink>
+    </w:p>
+    <w:p>
+      <w:r>
+        <w:t>S r n 01 .2</w:t>
       </w:r>
     </w:p>
     <w:sectPr>
@@ -7442,12 +7458,23 @@
     <w:name w:val="Hyperlink"/>
     <w:basedOn w:val="Fuentedeprrafopredeter"/>
     <w:uiPriority w:val="99"/>
-    <w:semiHidden/>
     <w:unhideWhenUsed/>
     <w:rsid w:val="001F35B9"/>
     <w:rPr>
       <w:color w:val="0000FF"/>
       <w:u w:val="single"/>
+    </w:rPr>
+  </w:style>
+  <w:style w:type="character" w:styleId="Mencinsinresolver">
+    <w:name w:val="Unresolved Mention"/>
+    <w:basedOn w:val="Fuentedeprrafopredeter"/>
+    <w:uiPriority w:val="99"/>
+    <w:semiHidden/>
+    <w:unhideWhenUsed/>
+    <w:rsid w:val="00314BE5"/>
+    <w:rPr>
+      <w:color w:val="605E5C"/>
+      <w:shd w:val="clear" w:color="auto" w:fill="E1DFDD"/>
     </w:rPr>
   </w:style>
 </w:styles>

</xml_diff>

<commit_message>
Bloque 2: trazabilidad del ciclo de materiales
- La requisición toma el motivo del tipo de la orden (un preventivo dejaba de
  clasificarse como correctivo)
- Surtir recalcula el costo de la OT; devolver baja ese consumo conservando el
  cargo original y el movimiento en el Kardex
- Saldo y surtido se escriben solo si siguen como se leyeron: el doble clic ya
  no descuenta dos veces
- El faltante queda ligado a su renglón y no se puede comprar dos veces
- Se aplica el umbral de autorización; sin firma no se coloca la compra
- Recepción: valida estado, pertenencia y exceso, y el mismo recibo repetido
  entra una sola vez
- Inventario marca lo que ya viene en camino; la requisición avisa costos
  pendientes
- lib/requisiciones-datos.ts separa el catálogo puro del código con Prisma
- Prueba nueva del ciclo completo (35 verificaciones) y migración aditiva

Co-Authored-By: Claude Opus 5 <noreply@anthropic.com>
</commit_message>
<xml_diff>
--- a/Cambios y prompts.docx
+++ b/Cambios y prompts.docx
@@ -3386,13 +3386,8 @@
     </w:p>
     <w:p>
       <w:r>
-        <w:rPr>
-          <w:noProof/>
-        </w:rPr>
-      </w:r>
-      <w:r>
-        <w:pict w14:anchorId="3AACBB72">
-          <v:rect id="Horizontal Line 1" o:spid="_x0000_s1029" style="width:441.9pt;height:.1pt;visibility:visible;mso-wrap-style:square;mso-left-percent:-10001;mso-top-percent:-10001;mso-position-horizontal:absolute;mso-position-horizontal-relative:char;mso-position-vertical:absolute;mso-position-vertical-relative:line;mso-left-percent:-10001;mso-top-percent:-10001;v-text-anchor:top" o:gfxdata="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" filled="f">
+        <w:pict w14:anchorId="34FBF54D">
+          <v:rect id="Horizontal Line 1" o:spid="_x0000_s1029" alt="" style="width:441.9pt;height:.1pt;visibility:visible;mso-wrap-style:square;mso-width-percent:0;mso-height-percent:0;mso-left-percent:-10001;mso-top-percent:-10001;mso-position-horizontal:absolute;mso-position-horizontal-relative:char;mso-position-vertical:absolute;mso-position-vertical-relative:line;mso-width-percent:0;mso-height-percent:0;mso-left-percent:-10001;mso-top-percent:-10001;v-text-anchor:top" filled="f">
             <o:lock v:ext="edit" rotation="t" aspectratio="t" verticies="t" text="t" shapetype="t"/>
             <w10:anchorlock/>
           </v:rect>
@@ -3588,13 +3583,8 @@
     </w:p>
     <w:p>
       <w:r>
-        <w:rPr>
-          <w:noProof/>
-        </w:rPr>
-      </w:r>
-      <w:r>
-        <w:pict w14:anchorId="0F4B2BF7">
-          <v:rect id="Horizontal Line 2" o:spid="_x0000_s1028" style="width:441.9pt;height:.1pt;visibility:visible;mso-wrap-style:square;mso-left-percent:-10001;mso-top-percent:-10001;mso-position-horizontal:absolute;mso-position-horizontal-relative:char;mso-position-vertical:absolute;mso-position-vertical-relative:line;mso-left-percent:-10001;mso-top-percent:-10001;v-text-anchor:top" o:gfxdata="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" filled="f">
+        <w:pict w14:anchorId="271330F9">
+          <v:rect id="Horizontal Line 2" o:spid="_x0000_s1028" alt="" style="width:441.9pt;height:.1pt;visibility:visible;mso-wrap-style:square;mso-width-percent:0;mso-height-percent:0;mso-left-percent:-10001;mso-top-percent:-10001;mso-position-horizontal:absolute;mso-position-horizontal-relative:char;mso-position-vertical:absolute;mso-position-vertical-relative:line;mso-width-percent:0;mso-height-percent:0;mso-left-percent:-10001;mso-top-percent:-10001;v-text-anchor:top" filled="f">
             <o:lock v:ext="edit" rotation="t" aspectratio="t" verticies="t" text="t" shapetype="t"/>
             <w10:anchorlock/>
           </v:rect>
@@ -4201,13 +4191,8 @@
     </w:p>
     <w:p>
       <w:r>
-        <w:rPr>
-          <w:noProof/>
-        </w:rPr>
-      </w:r>
-      <w:r>
-        <w:pict w14:anchorId="6158D34C">
-          <v:rect id="Horizontal Line 3" o:spid="_x0000_s1027" style="width:441.9pt;height:.1pt;visibility:visible;mso-wrap-style:square;mso-left-percent:-10001;mso-top-percent:-10001;mso-position-horizontal:absolute;mso-position-horizontal-relative:char;mso-position-vertical:absolute;mso-position-vertical-relative:line;mso-left-percent:-10001;mso-top-percent:-10001;v-text-anchor:top" o:gfxdata="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" filled="f">
+        <w:pict w14:anchorId="5DF0CE2D">
+          <v:rect id="Horizontal Line 3" o:spid="_x0000_s1027" alt="" style="width:441.9pt;height:.1pt;visibility:visible;mso-wrap-style:square;mso-width-percent:0;mso-height-percent:0;mso-left-percent:-10001;mso-top-percent:-10001;mso-position-horizontal:absolute;mso-position-horizontal-relative:char;mso-position-vertical:absolute;mso-position-vertical-relative:line;mso-width-percent:0;mso-height-percent:0;mso-left-percent:-10001;mso-top-percent:-10001;v-text-anchor:top" filled="f">
             <o:lock v:ext="edit" rotation="t" aspectratio="t" verticies="t" text="t" shapetype="t"/>
             <w10:anchorlock/>
           </v:rect>
@@ -4453,13 +4438,8 @@
     </w:p>
     <w:p>
       <w:r>
-        <w:rPr>
-          <w:noProof/>
-        </w:rPr>
-      </w:r>
-      <w:r>
-        <w:pict w14:anchorId="3B08CAAB">
-          <v:rect id="Horizontal Line 4" o:spid="_x0000_s1026" style="width:441.9pt;height:.1pt;visibility:visible;mso-wrap-style:square;mso-left-percent:-10001;mso-top-percent:-10001;mso-position-horizontal:absolute;mso-position-horizontal-relative:char;mso-position-vertical:absolute;mso-position-vertical-relative:line;mso-left-percent:-10001;mso-top-percent:-10001;v-text-anchor:top" o:gfxdata="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" filled="f">
+        <w:pict w14:anchorId="0FFE38D9">
+          <v:rect id="Horizontal Line 4" o:spid="_x0000_s1026" alt="" style="width:441.9pt;height:.1pt;visibility:visible;mso-wrap-style:square;mso-width-percent:0;mso-height-percent:0;mso-left-percent:-10001;mso-top-percent:-10001;mso-position-horizontal:absolute;mso-position-horizontal-relative:char;mso-position-vertical:absolute;mso-position-vertical-relative:line;mso-width-percent:0;mso-height-percent:0;mso-left-percent:-10001;mso-top-percent:-10001;v-text-anchor:top" filled="f">
             <o:lock v:ext="edit" rotation="t" aspectratio="t" verticies="t" text="t" shapetype="t"/>
             <w10:anchorlock/>
           </v:rect>
@@ -6461,6 +6441,39 @@
           <w:bCs/>
         </w:rPr>
       </w:pPr>
+    </w:p>
+    <w:p>
+      <w:pPr>
+        <w:rPr>
+          <w:b/>
+          <w:bCs/>
+        </w:rPr>
+      </w:pPr>
+      <w:hyperlink r:id="rId13" w:history="1">
+        <w:r>
+          <w:rPr>
+            <w:rStyle w:val="Hipervnculo"/>
+            <w:b/>
+            <w:bCs/>
+          </w:rPr>
+          <w:t>userchat@maintrack.com</w:t>
+        </w:r>
+      </w:hyperlink>
+    </w:p>
+    <w:p>
+      <w:pPr>
+        <w:rPr>
+          <w:b/>
+          <w:bCs/>
+        </w:rPr>
+      </w:pPr>
+      <w:r>
+        <w:rPr>
+          <w:b/>
+          <w:bCs/>
+        </w:rPr>
+        <w:t>Eldemo100</w:t>
+      </w:r>
     </w:p>
     <w:sectPr>
       <w:pgSz w:w="12240" w:h="15840"/>

</xml_diff>